<commit_message>
finished Lab 2 up to Step 3, just missing some clarification questions and edge cases now
</commit_message>
<xml_diff>
--- a/Jess_Lab2/Lab2 - Basic Data Structures.docx
+++ b/Jess_Lab2/Lab2 - Basic Data Structures.docx
@@ -4,7 +4,7 @@
   <w:body>
     <w:p>
       <w:pPr>
-        <w:pStyle w:val="Title"/>
+        <w:pStyle w:val="Ttulo"/>
       </w:pPr>
       <w:bookmarkStart w:id="0" w:name="_heading=h.tdssntwitd95" w:colFirst="0" w:colLast="0"/>
       <w:bookmarkEnd w:id="0"/>
@@ -17,23 +17,35 @@
         <w:t>You may work with a partner</w:t>
       </w:r>
     </w:p>
+    <w:p>
+      <w:r>
+        <w:t>Exception: ZeroDivisionError for frequencies</w:t>
+      </w:r>
+      <w:r>
+        <w:t xml:space="preserve"> (empty text)</w:t>
+      </w:r>
+    </w:p>
+    <w:p>
+      <w:r>
+        <w:t>Special case: american/canadian? Text only contains stopwords?</w:t>
+      </w:r>
+    </w:p>
     <w:p/>
+    <w:p>
+      <w:r>
+        <w:t>In this lab</w:t>
+      </w:r>
+      <w:r>
+        <w:t>,</w:t>
+      </w:r>
+      <w:r>
+        <w:t xml:space="preserve"> you will process some text data using lists, sets, and dictionaries. Write your program in main.py. The steps below describe tasks you must accomplish, but the coding is up to you. Try to decompose your program into functions to keep it organized.</w:t>
+      </w:r>
+    </w:p>
     <w:p/>
     <w:p>
-      <w:r>
-        <w:t>In this lab</w:t>
-      </w:r>
-      <w:r>
-        <w:t>,</w:t>
-      </w:r>
-      <w:r>
-        <w:t xml:space="preserve"> you will process some text data using lists, sets, and dictionaries. Write your program in main.py. The steps below describe tasks you must accomplish, but the coding is up to you. Try to decompose your program into functions to keep it organized.</w:t>
-      </w:r>
-    </w:p>
-    <w:p/>
-    <w:p>
-      <w:pPr>
-        <w:pStyle w:val="Heading3"/>
+      <w:pPr>
+        <w:pStyle w:val="Ttulo3"/>
       </w:pPr>
       <w:bookmarkStart w:id="1" w:name="_heading=h.ayp6grnjxrcp" w:colFirst="0" w:colLast="0"/>
       <w:bookmarkEnd w:id="1"/>
@@ -49,29 +61,13 @@
         <w:t xml:space="preserve"> </w:t>
       </w:r>
       <w:r>
-        <w:t>you will find 2 “text” documents and 1 “</w:t>
-      </w:r>
-      <w:proofErr w:type="spellStart"/>
-      <w:r>
-        <w:t>stopwords</w:t>
-      </w:r>
-      <w:proofErr w:type="spellEnd"/>
-      <w:r>
-        <w:t>” document.</w:t>
+        <w:t>you will find 2 “text” documents and 1 “stopwords” document.</w:t>
       </w:r>
     </w:p>
     <w:p/>
     <w:p>
       <w:r>
-        <w:t xml:space="preserve">The </w:t>
-      </w:r>
-      <w:proofErr w:type="spellStart"/>
-      <w:r>
-        <w:t>stopwords</w:t>
-      </w:r>
-      <w:proofErr w:type="spellEnd"/>
-      <w:r>
-        <w:t xml:space="preserve"> document contains words that appear frequently in English documents, but don’t add a lot of semantic meaning (words like “a”, “me”, “it”, etc.). Read this document and create a </w:t>
+        <w:t xml:space="preserve">The stopwords document contains words that appear frequently in English documents, but don’t add a lot of semantic meaning (words like “a”, “me”, “it”, etc.). Read this document and create a </w:t>
       </w:r>
       <w:r>
         <w:rPr>
@@ -102,21 +98,13 @@
         <w:t xml:space="preserve">Exclude </w:t>
       </w:r>
       <w:r>
-        <w:t xml:space="preserve">all </w:t>
-      </w:r>
-      <w:proofErr w:type="spellStart"/>
-      <w:r>
-        <w:t>stopwords</w:t>
-      </w:r>
-      <w:proofErr w:type="spellEnd"/>
-      <w:r>
-        <w:t xml:space="preserve"> from these lists.</w:t>
+        <w:t>all stopwords from these lists.</w:t>
       </w:r>
     </w:p>
     <w:p/>
     <w:p>
       <w:pPr>
-        <w:pStyle w:val="Heading3"/>
+        <w:pStyle w:val="Ttulo3"/>
       </w:pPr>
       <w:bookmarkStart w:id="2" w:name="_heading=h.ijocy1g5j3jz" w:colFirst="0" w:colLast="0"/>
       <w:bookmarkEnd w:id="2"/>
@@ -138,19 +126,7 @@
     <w:p/>
     <w:p>
       <w:r>
-        <w:t>Now convert these raw counts into term frequency scores. “Term frequency” is just the relative frequency of the word in the document. So the term frequency (</w:t>
-      </w:r>
-      <w:proofErr w:type="spellStart"/>
-      <w:r>
-        <w:t>tf</w:t>
-      </w:r>
-      <w:proofErr w:type="spellEnd"/>
-      <w:r>
-        <w:t xml:space="preserve">) for the word </w:t>
-      </w:r>
-      <w:proofErr w:type="spellStart"/>
-      <w:r>
-        <w:t>w</w:t>
+        <w:t>Now convert these raw counts into term frequency scores. “Term frequency” is just the relative frequency of the word in the document. So the term frequency (tf) for the word w</w:t>
       </w:r>
       <w:r>
         <w:rPr>
@@ -158,7 +134,6 @@
         </w:rPr>
         <w:t>i</w:t>
       </w:r>
-      <w:proofErr w:type="spellEnd"/>
       <w:r>
         <w:t xml:space="preserve"> is:</w:t>
       </w:r>
@@ -224,7 +199,7 @@
     <w:p/>
     <w:p>
       <w:pPr>
-        <w:pStyle w:val="Heading3"/>
+        <w:pStyle w:val="Ttulo3"/>
       </w:pPr>
       <w:bookmarkStart w:id="3" w:name="_heading=h.81m74u3cxy9n" w:colFirst="0" w:colLast="0"/>
       <w:bookmarkEnd w:id="3"/>
@@ -240,7 +215,6 @@
     <w:p/>
     <w:p>
       <w:r>
-        <w:lastRenderedPageBreak/>
         <w:t xml:space="preserve">To do this, first compute (and print) the set of words that is </w:t>
       </w:r>
       <w:r>
@@ -255,7 +229,7 @@
     </w:p>
     <w:p>
       <w:pPr>
-        <w:pStyle w:val="Heading2"/>
+        <w:pStyle w:val="Ttulo2"/>
       </w:pPr>
       <w:r>
         <w:t>Present Your Lab Solution in Jupyter Notebook</w:t>
@@ -517,7 +491,7 @@
     </w:p>
     <w:p>
       <w:pPr>
-        <w:pStyle w:val="Heading2"/>
+        <w:pStyle w:val="Ttulo2"/>
       </w:pPr>
       <w:bookmarkStart w:id="4" w:name="_kddck56itq2u" w:colFirst="0" w:colLast="0"/>
       <w:bookmarkEnd w:id="4"/>
@@ -571,13 +545,7 @@
         <w:rPr>
           <w:lang w:val="en-US"/>
         </w:rPr>
-        <w:t>)</w:t>
-      </w:r>
-      <w:r>
-        <w:rPr>
-          <w:lang w:val="en-US"/>
-        </w:rPr>
-        <w:t xml:space="preserve"> </w:t>
+        <w:t xml:space="preserve">) </w:t>
       </w:r>
       <w:r>
         <w:rPr>
@@ -600,35 +568,7 @@
         <w:rPr>
           <w:lang w:val="en-US"/>
         </w:rPr>
-        <w:t>All source files (.</w:t>
-      </w:r>
-      <w:proofErr w:type="spellStart"/>
-      <w:r>
-        <w:rPr>
-          <w:lang w:val="en-US"/>
-        </w:rPr>
-        <w:t>py</w:t>
-      </w:r>
-      <w:proofErr w:type="spellEnd"/>
-      <w:r>
-        <w:rPr>
-          <w:lang w:val="en-US"/>
-        </w:rPr>
-        <w:t>) and your Jupyter Notebook (.</w:t>
-      </w:r>
-      <w:proofErr w:type="spellStart"/>
-      <w:r>
-        <w:rPr>
-          <w:lang w:val="en-US"/>
-        </w:rPr>
-        <w:t>ipynb</w:t>
-      </w:r>
-      <w:proofErr w:type="spellEnd"/>
-      <w:r>
-        <w:rPr>
-          <w:lang w:val="en-US"/>
-        </w:rPr>
-        <w:t xml:space="preserve">). </w:t>
+        <w:t xml:space="preserve">All source files (.py) and your Jupyter Notebook (.ipynb). </w:t>
       </w:r>
     </w:p>
     <w:p>
@@ -691,7 +631,7 @@
     </w:p>
     <w:p>
       <w:pPr>
-        <w:pStyle w:val="BodyText"/>
+        <w:pStyle w:val="Textoindependiente"/>
         <w:spacing w:before="60" w:after="60" w:line="288" w:lineRule="auto"/>
         <w:jc w:val="both"/>
         <w:rPr>
@@ -1856,7 +1796,7 @@
     <w:name w:val="Normal"/>
     <w:qFormat/>
   </w:style>
-  <w:style w:type="paragraph" w:styleId="Heading1">
+  <w:style w:type="paragraph" w:styleId="Ttulo1">
     <w:name w:val="heading 1"/>
     <w:basedOn w:val="Normal"/>
     <w:next w:val="Normal"/>
@@ -1873,7 +1813,7 @@
       <w:szCs w:val="40"/>
     </w:rPr>
   </w:style>
-  <w:style w:type="paragraph" w:styleId="Heading2">
+  <w:style w:type="paragraph" w:styleId="Ttulo2">
     <w:name w:val="heading 2"/>
     <w:basedOn w:val="Normal"/>
     <w:next w:val="Normal"/>
@@ -1891,7 +1831,7 @@
       <w:szCs w:val="32"/>
     </w:rPr>
   </w:style>
-  <w:style w:type="paragraph" w:styleId="Heading3">
+  <w:style w:type="paragraph" w:styleId="Ttulo3">
     <w:name w:val="heading 3"/>
     <w:basedOn w:val="Normal"/>
     <w:next w:val="Normal"/>
@@ -1910,7 +1850,7 @@
       <w:szCs w:val="28"/>
     </w:rPr>
   </w:style>
-  <w:style w:type="paragraph" w:styleId="Heading4">
+  <w:style w:type="paragraph" w:styleId="Ttulo4">
     <w:name w:val="heading 4"/>
     <w:basedOn w:val="Normal"/>
     <w:next w:val="Normal"/>
@@ -1930,7 +1870,7 @@
       <w:szCs w:val="24"/>
     </w:rPr>
   </w:style>
-  <w:style w:type="paragraph" w:styleId="Heading5">
+  <w:style w:type="paragraph" w:styleId="Ttulo5">
     <w:name w:val="heading 5"/>
     <w:basedOn w:val="Normal"/>
     <w:next w:val="Normal"/>
@@ -1948,7 +1888,7 @@
       <w:color w:val="666666"/>
     </w:rPr>
   </w:style>
-  <w:style w:type="paragraph" w:styleId="Heading6">
+  <w:style w:type="paragraph" w:styleId="Ttulo6">
     <w:name w:val="heading 6"/>
     <w:basedOn w:val="Normal"/>
     <w:next w:val="Normal"/>
@@ -1967,13 +1907,13 @@
       <w:color w:val="666666"/>
     </w:rPr>
   </w:style>
-  <w:style w:type="character" w:default="1" w:styleId="DefaultParagraphFont">
+  <w:style w:type="character" w:default="1" w:styleId="Fuentedeprrafopredeter">
     <w:name w:val="Default Paragraph Font"/>
     <w:uiPriority w:val="1"/>
     <w:semiHidden/>
     <w:unhideWhenUsed/>
   </w:style>
-  <w:style w:type="table" w:default="1" w:styleId="TableNormal">
+  <w:style w:type="table" w:default="1" w:styleId="Tablanormal">
     <w:name w:val="Normal Table"/>
     <w:uiPriority w:val="99"/>
     <w:semiHidden/>
@@ -1988,13 +1928,13 @@
       </w:tblCellMar>
     </w:tblPr>
   </w:style>
-  <w:style w:type="numbering" w:default="1" w:styleId="NoList">
+  <w:style w:type="numbering" w:default="1" w:styleId="Sinlista">
     <w:name w:val="No List"/>
     <w:uiPriority w:val="99"/>
     <w:semiHidden/>
     <w:unhideWhenUsed/>
   </w:style>
-  <w:style w:type="table" w:customStyle="1" w:styleId="TableNormal0">
+  <w:style w:type="table" w:customStyle="1" w:styleId="TableNormal">
     <w:name w:val="TableNormal"/>
     <w:tblPr>
       <w:tblCellMar>
@@ -2005,7 +1945,7 @@
       </w:tblCellMar>
     </w:tblPr>
   </w:style>
-  <w:style w:type="paragraph" w:styleId="Title">
+  <w:style w:type="paragraph" w:styleId="Ttulo">
     <w:name w:val="Title"/>
     <w:basedOn w:val="Normal"/>
     <w:next w:val="Normal"/>
@@ -2021,7 +1961,7 @@
       <w:szCs w:val="52"/>
     </w:rPr>
   </w:style>
-  <w:style w:type="table" w:customStyle="1" w:styleId="TableNormal1">
+  <w:style w:type="table" w:customStyle="1" w:styleId="TableNormal0">
     <w:name w:val="TableNormal"/>
     <w:tblPr>
       <w:tblCellMar>
@@ -2032,7 +1972,7 @@
       </w:tblCellMar>
     </w:tblPr>
   </w:style>
-  <w:style w:type="paragraph" w:styleId="Subtitle">
+  <w:style w:type="paragraph" w:styleId="Subttulo">
     <w:name w:val="Subtitle"/>
     <w:basedOn w:val="Normal"/>
     <w:next w:val="Normal"/>
@@ -2049,10 +1989,10 @@
       <w:szCs w:val="30"/>
     </w:rPr>
   </w:style>
-  <w:style w:type="paragraph" w:styleId="BodyText">
+  <w:style w:type="paragraph" w:styleId="Textoindependiente">
     <w:name w:val="Body Text"/>
     <w:basedOn w:val="Normal"/>
-    <w:link w:val="BodyTextChar"/>
+    <w:link w:val="TextoindependienteCar"/>
     <w:qFormat/>
     <w:rsid w:val="00147E03"/>
     <w:pPr>
@@ -2065,10 +2005,10 @@
       <w:lang w:val="en-US" w:eastAsia="zh-CN"/>
     </w:rPr>
   </w:style>
-  <w:style w:type="character" w:customStyle="1" w:styleId="BodyTextChar">
-    <w:name w:val="Body Text Char"/>
-    <w:basedOn w:val="DefaultParagraphFont"/>
-    <w:link w:val="BodyText"/>
+  <w:style w:type="character" w:customStyle="1" w:styleId="TextoindependienteCar">
+    <w:name w:val="Texto independiente Car"/>
+    <w:basedOn w:val="Fuentedeprrafopredeter"/>
+    <w:link w:val="Textoindependiente"/>
     <w:rsid w:val="00147E03"/>
     <w:rPr>
       <w:rFonts w:asciiTheme="minorHAnsi" w:eastAsiaTheme="minorEastAsia" w:hAnsiTheme="minorHAnsi" w:cstheme="minorBidi"/>

</xml_diff>